<commit_message>
Document Cheqroom for equipment tracking, add AV/Live Event Production Agreement contract, add Braceworks line item to Software Wishlist
</commit_message>
<xml_diff>
--- a/reference-docs/Revital_Software_Insurance_Wishlist.docx
+++ b/reference-docs/Revital_Software_Insurance_Wishlist.docx
@@ -2007,6 +2007,80 @@
                 <w:szCs w:val="18"/>
               </w:rPr>
               <w:t xml:space="preserve">Industry-standard AV/lighting/rigging technical drawings — precise 2D/3D floor plans, lighting plots, truss and staging diagrams. Pairs with Braceworks for structural rigging calculations. The standard tool for touring and corporate AV production.</w:t>
+            </w:r>
+          </w:p>
+        </w:tc>
+      </w:tr>
+      <w:tr>
+        <w:tc>
+          <w:tcPr>
+            <w:tcW w:type="dxa" w:w="3200"/>
+            <w:tcMar>
+              <w:top w:type="dxa" w:w="90"/>
+              <w:left w:type="dxa" w:w="110"/>
+              <w:bottom w:type="dxa" w:w="90"/>
+              <w:right w:type="dxa" w:w="110"/>
+            </w:tcMar>
+          </w:tcPr>
+          <w:p>
+            <w:r>
+              <w:rPr>
+                <w:rFonts w:ascii="Arial" w:cs="Arial" w:eastAsia="Arial" w:hAnsi="Arial"/>
+                <w:b/>
+                <w:bCs/>
+                <w:color w:val="1F2937"/>
+                <w:sz w:val="18"/>
+                <w:szCs w:val="18"/>
+              </w:rPr>
+              <w:t xml:space="preserve">Braceworks</w:t>
+            </w:r>
+          </w:p>
+        </w:tc>
+        <w:tc>
+          <w:tcPr>
+            <w:tcW w:type="dxa" w:w="1800"/>
+            <w:tcMar>
+              <w:top w:type="dxa" w:w="90"/>
+              <w:left w:type="dxa" w:w="110"/>
+              <w:bottom w:type="dxa" w:w="90"/>
+              <w:right w:type="dxa" w:w="110"/>
+            </w:tcMar>
+          </w:tcPr>
+          <w:p>
+            <w:r>
+              <w:rPr>
+                <w:rFonts w:ascii="Arial" w:cs="Arial" w:eastAsia="Arial" w:hAnsi="Arial"/>
+                <w:b w:val="false"/>
+                <w:bCs w:val="false"/>
+                <w:color w:val="1F2937"/>
+                <w:sz w:val="18"/>
+                <w:szCs w:val="18"/>
+              </w:rPr>
+              <w:t xml:space="preserve">~$300–500/yr add-on</w:t>
+            </w:r>
+          </w:p>
+        </w:tc>
+        <w:tc>
+          <w:tcPr>
+            <w:tcW w:type="dxa" w:w="5200"/>
+            <w:tcMar>
+              <w:top w:type="dxa" w:w="90"/>
+              <w:left w:type="dxa" w:w="110"/>
+              <w:bottom w:type="dxa" w:w="90"/>
+              <w:right w:type="dxa" w:w="110"/>
+            </w:tcMar>
+          </w:tcPr>
+          <w:p>
+            <w:r>
+              <w:rPr>
+                <w:rFonts w:ascii="Arial" w:cs="Arial" w:eastAsia="Arial" w:hAnsi="Arial"/>
+                <w:b w:val="false"/>
+                <w:bCs w:val="false"/>
+                <w:color w:val="1F2937"/>
+                <w:sz w:val="18"/>
+                <w:szCs w:val="18"/>
+              </w:rPr>
+              <w:t xml:space="preserve">Structural rigging load calculations for hanging speaker arrays and trussing — the actual safety math, not just the drawing. A separate paid add-on to Vectorworks Spotlight; only bundled with a Spotlight or Design Suite subscription, not included by default.</w:t>
             </w:r>
           </w:p>
         </w:tc>

</xml_diff>

<commit_message>
Update ESignature Setup Guide and Software Insurance Wishlist reference docs
</commit_message>
<xml_diff>
--- a/reference-docs/Revital_Software_Insurance_Wishlist.docx
+++ b/reference-docs/Revital_Software_Insurance_Wishlist.docx
@@ -4067,7 +4067,7 @@
                 <w:sz w:val="18"/>
                 <w:szCs w:val="18"/>
               </w:rPr>
-              <w:t xml:space="preserve">Dropbox Sign (HelloSign)</w:t>
+              <w:t xml:space="preserve">DocuSign</w:t>
             </w:r>
           </w:p>
         </w:tc>
@@ -4091,7 +4091,7 @@
                 <w:sz w:val="18"/>
                 <w:szCs w:val="18"/>
               </w:rPr>
-              <w:t xml:space="preserve">$15/mo</w:t>
+              <w:t xml:space="preserve">$25–45/mo</w:t>
             </w:r>
           </w:p>
         </w:tc>
@@ -4115,7 +4115,7 @@
                 <w:sz w:val="18"/>
                 <w:szCs w:val="18"/>
               </w:rPr>
-              <w:t xml:space="preserve">Legally binding e-signatures on contracts — you already have a full setup guide for this saved ("E-Signature Setup Guide"), just waiting on the $15/mo. Replaces the current print/sign/scan process.</w:t>
+              <w:t xml:space="preserve">Legally binding e-signatures on contracts — replaces the current print/sign/scan process. Needs the Standard plan (not Personal) since the SOW/MSA workflow relies on reusable Templates, which Personal doesn’t include. Setup steps are in the E-Signature Setup Guide.</w:t>
             </w:r>
           </w:p>
         </w:tc>
@@ -5047,7 +5047,7 @@
                 <w:sz w:val="18"/>
                 <w:szCs w:val="18"/>
               </w:rPr>
-              <w:t xml:space="preserve">Dropbox Sign</w:t>
+              <w:t xml:space="preserve">DocuSign</w:t>
             </w:r>
           </w:p>
         </w:tc>
@@ -5072,7 +5072,7 @@
                 <w:sz w:val="18"/>
                 <w:szCs w:val="18"/>
               </w:rPr>
-              <w:t xml:space="preserve">DocuSign; PandaDoc</w:t>
+              <w:t xml:space="preserve">Dropbox Sign (HelloSign); PandaDoc</w:t>
             </w:r>
           </w:p>
         </w:tc>
@@ -5097,7 +5097,7 @@
                 <w:sz w:val="18"/>
                 <w:szCs w:val="18"/>
               </w:rPr>
-              <w:t xml:space="preserve">DocuSign is the more recognizable brand name to clients; PandaDoc adds proposal/quote building on top of e-signatures.</w:t>
+              <w:t xml:space="preserve">Dropbox Sign (HelloSign) is cheaper per month with a simpler interface; PandaDoc adds proposal/quote building on top of e-signatures.</w:t>
             </w:r>
           </w:p>
         </w:tc>

</xml_diff>